<commit_message>
feat(bieu-mau): số và ngày văn bản hướng dẫn tự điền vào dòng căn cứ; migration thêm cột
</commit_message>
<xml_diff>
--- a/backend/src/CongTacDang.Infrastructure/Templates/Word/Mau_07_BaoCaoTuDanhGiaTapThe.docx
+++ b/backend/src/CongTacDang.Infrastructure/Templates/Word/Mau_07_BaoCaoTuDanhGiaTapThe.docx
@@ -1352,7 +1352,57 @@
           <w:szCs w:val="24"/>
           <w:lang w:eastAsia="en-US"/>
         </w:rPr>
-        <w:t>(Theo khung tiêu chí đánh giá đối với tập thể được quy định tại Phụ lục 1, Hướng dẫn số…-HD/TVĐU ngày… của Ban Thường vụ Đảng ủy Tổng công ty)</w:t>
+        <w:t xml:space="preserve">(Theo khung tiêu chí đánh giá đối với tập thể được quy định tại Phụ lục 1, Hướng dẫn số </w:t>
+      </w:r>
+      <w:sdt>
+        <w:sdtPr>
+          <w:alias w:val="ORG_GUIDE_NO"/>
+          <w:tag w:val="ORG_GUIDE_NO"/>
+          <w:id w:val="914001"/>
+        </w:sdtPr>
+        <w:sdtContent>
+          <w:r>
+            <w:rPr>
+              <w:sz w:val="24"/>
+              <w:szCs w:val="24"/>
+              <w:lang w:eastAsia="en-US"/>
+            </w:rPr>
+            <w:t xml:space="preserve">…-HD/TVĐU</w:t>
+          </w:r>
+        </w:sdtContent>
+      </w:sdt>
+      <w:r>
+        <w:rPr>
+          <w:sz w:val="24"/>
+          <w:szCs w:val="24"/>
+          <w:lang w:eastAsia="en-US"/>
+        </w:rPr>
+        <w:t xml:space="preserve"> ngày </w:t>
+      </w:r>
+      <w:sdt>
+        <w:sdtPr>
+          <w:alias w:val="ORG_GUIDE_DATE"/>
+          <w:tag w:val="ORG_GUIDE_DATE"/>
+          <w:id w:val="914000"/>
+        </w:sdtPr>
+        <w:sdtContent>
+          <w:r>
+            <w:rPr>
+              <w:sz w:val="24"/>
+              <w:szCs w:val="24"/>
+              <w:lang w:eastAsia="en-US"/>
+            </w:rPr>
+            <w:t xml:space="preserve">…</w:t>
+          </w:r>
+        </w:sdtContent>
+      </w:sdt>
+      <w:r>
+        <w:rPr>
+          <w:sz w:val="24"/>
+          <w:szCs w:val="24"/>
+          <w:lang w:eastAsia="en-US"/>
+        </w:rPr>
+        <w:t xml:space="preserve"> của Ban Thường vụ Đảng ủy Tổng công ty)</w:t>
       </w:r>
     </w:p>
     <w:p>

</xml_diff>